<commit_message>
Replace em/en dashes with plain hyphens for ATS-friendliness
Swaps all em-dashes (—) and en-dashes (–) for standard hyphens across the resume
PDF and both editable Word files; verified zero em/en dashes remain.

Co-Authored-By: Claude Opus 4.8 <noreply@anthropic.com>
Claude-Session: https://claude.ai/code/session_01Hxs2FjUak53Pg3DVizywx4
</commit_message>
<xml_diff>
--- a/Juhi_Bhalla_Resume_6.docx
+++ b/Juhi_Bhalla_Resume_6.docx
@@ -27,7 +27,7 @@
         </w:rPr>
         <w:t xml:space="preserve">+91 88709 52224   |   juhibhalla.jblko@gmail.com   |   </w:t>
       </w:r>
-      <w:hyperlink w:history="1" r:id="rIdn2apq66emeqp5nwxuvok2">
+      <w:hyperlink w:history="1" r:id="rIdbczuokbmq8g_teutn5f7i">
         <w:r>
           <w:rPr>
             <w:color w:val="0563C1"/>
@@ -91,7 +91,7 @@
           <w:sz w:val="19"/>
           <w:szCs w:val="19"/>
         </w:rPr>
-        <w:t xml:space="preserve">E-commerce and retail Business Analyst with 5+ years owning category growth and analytics at Flipkart and Enverus (B2B SaaS). Expert in category strategy, assortment, pricing and promotions, demand forecasting, and 360° reporting — turning data into revenue and margin growth. Known for solving ambiguous problems through analytics and cross-functional stakeholder management.</w:t>
+        <w:t xml:space="preserve">E-commerce and retail Business Analyst with 5+ years owning category growth and analytics at Flipkart and Enverus (B2B SaaS). Expert in category strategy, assortment, pricing and promotions, demand forecasting, and 360° reporting - turning data into revenue and margin growth. Known for solving ambiguous problems through analytics and cross-functional stakeholder management.</w:t>
       </w:r>
     </w:p>
     <w:p>
@@ -129,7 +129,7 @@
           <w:sz w:val="20"/>
           <w:szCs w:val="20"/>
         </w:rPr>
-        <w:t xml:space="preserve"> – Assistant Manager – Business Development, Large Appliances (eCommerce)  |  </w:t>
+        <w:t xml:space="preserve"> - Assistant Manager - Business Development, Large Appliances (eCommerce)  |  </w:t>
       </w:r>
       <w:r>
         <w:rPr>
@@ -137,7 +137,7 @@
           <w:sz w:val="20"/>
           <w:szCs w:val="20"/>
         </w:rPr>
-        <w:t xml:space="preserve">Jun 2024 – Sep 2026</w:t>
+        <w:t xml:space="preserve">Jun 2024 - Sep 2026</w:t>
       </w:r>
     </w:p>
     <w:p>
@@ -160,7 +160,7 @@
           <w:sz w:val="19"/>
           <w:szCs w:val="19"/>
         </w:rPr>
-        <w:t xml:space="preserve">Owned category, seller &amp; SKU performance for a large marketplace category — driving growth via assortment, pricing, promotions, and demand planning across GMV, conversion, and in-stock.</w:t>
+        <w:t xml:space="preserve">Owned category, seller &amp; SKU performance for a large marketplace category - driving growth via assortment, pricing, promotions, and demand planning across GMV, conversion, and in-stock.</w:t>
       </w:r>
       <w:r>
         <w:rPr>
@@ -574,7 +574,7 @@
           <w:sz w:val="20"/>
           <w:szCs w:val="20"/>
         </w:rPr>
-        <w:t xml:space="preserve"> – Business Analyst I – Market Research (B2B SaaS)  |  </w:t>
+        <w:t xml:space="preserve"> - Business Analyst I - Market Research (B2B SaaS)  |  </w:t>
       </w:r>
       <w:r>
         <w:rPr>
@@ -582,7 +582,7 @@
           <w:sz w:val="20"/>
           <w:szCs w:val="20"/>
         </w:rPr>
-        <w:t xml:space="preserve">Jan 2023 – May 2024</w:t>
+        <w:t xml:space="preserve">Jan 2023 - May 2024</w:t>
       </w:r>
     </w:p>
     <w:p>
@@ -706,7 +706,7 @@
           <w:sz w:val="20"/>
           <w:szCs w:val="20"/>
         </w:rPr>
-        <w:t xml:space="preserve">Associate – Commercial Intelligence</w:t>
+        <w:t xml:space="preserve">Associate - Commercial Intelligence</w:t>
       </w:r>
       <w:r>
         <w:rPr>
@@ -721,7 +721,7 @@
           <w:sz w:val="20"/>
           <w:szCs w:val="20"/>
         </w:rPr>
-        <w:t xml:space="preserve">May 2021 – Dec 2022</w:t>
+        <w:t xml:space="preserve">May 2021 - Dec 2022</w:t>
       </w:r>
     </w:p>
     <w:p>
@@ -789,14 +789,14 @@
           <w:sz w:val="19"/>
           <w:szCs w:val="19"/>
         </w:rPr>
-        <w:t xml:space="preserve">B.Tech – Biotechnology</w:t>
-      </w:r>
-      <w:r>
-        <w:rPr>
-          <w:sz w:val="19"/>
-          <w:szCs w:val="19"/>
-        </w:rPr>
-        <w:t xml:space="preserve"> | Vellore Institute of Technology (VIT) | 2017 – 2021 | GPA: 8.55 / 10</w:t>
+        <w:t xml:space="preserve">B.Tech - Biotechnology</w:t>
+      </w:r>
+      <w:r>
+        <w:rPr>
+          <w:sz w:val="19"/>
+          <w:szCs w:val="19"/>
+        </w:rPr>
+        <w:t xml:space="preserve"> | Vellore Institute of Technology (VIT) | 2017 - 2021 | GPA: 8.55 / 10</w:t>
       </w:r>
     </w:p>
     <w:p>
@@ -920,7 +920,7 @@
           <w:sz w:val="19"/>
           <w:szCs w:val="19"/>
         </w:rPr>
-        <w:t xml:space="preserve">800–1,000+ participants</w:t>
+        <w:t xml:space="preserve">800-1,000+ participants</w:t>
       </w:r>
       <w:r>
         <w:rPr>
@@ -948,7 +948,7 @@
           <w:sz w:val="19"/>
           <w:szCs w:val="19"/>
         </w:rPr>
-        <w:t xml:space="preserve">Consistent data-led growth record — </w:t>
+        <w:t xml:space="preserve">Consistent data-led growth record - </w:t>
       </w:r>
       <w:r>
         <w:rPr>

</xml_diff>